<commit_message>
Nota di consegna sprint 1: testo di llms.txt «da approvare», senza indicare chi approva
Co-Authored-By: Claude Opus 5.5 <noreply@anthropic.com>
Claude-Session: https://claude.ai/code/session_01Rr1X44gsg7BUwMzrRvYrc2
</commit_message>
<xml_diff>
--- a/docs/docx/nota-di-consegna-sprint-1.docx
+++ b/docs/docx/nota-di-consegna-sprint-1.docx
@@ -33,7 +33,7 @@
     <w:p>
       <w:pPr/>
       <w:r>
-        <w:t xml:space="preserve">Le dieci voci d'audit dello sprint 1 sono chiuse: sei con interventi in produzione, quattro risultavano già a posto e sono verificate con evidenza. Resta solo la conferma di KOS sulle frasi di sintesi di llms.txt, già pubblicato.</w:t>
+        <w:t xml:space="preserve">Le dieci voci d'audit dello sprint 1 sono chiuse: sei con interventi in produzione, quattro risultavano già a posto e sono verificate con evidenza. Resta da approvare il testo di sintesi di llms.txt, già pubblicato.</w:t>
       </w:r>
     </w:p>
     <w:tbl>
@@ -327,7 +327,7 @@
           <w:p>
             <w:pPr/>
             <w:r>
-              <w:t xml:space="preserve">Attende KOS</w:t>
+              <w:t xml:space="preserve">Da approvare</w:t>
             </w:r>
           </w:p>
         </w:tc>
@@ -988,7 +988,7 @@
               <w:t xml:space="preserve">text/plain; charset=utf-8</w:t>
             </w:r>
             <w:r>
-              <w:t xml:space="preserve">. Il testo della sintesi attende la conferma di KOS.</w:t>
+              <w:t xml:space="preserve">. Testo della sintesi da approvare.</w:t>
             </w:r>
           </w:p>
         </w:tc>
@@ -2671,7 +2671,7 @@
     <w:p>
       <w:pPr/>
       <w:r>
-        <w:t xml:space="preserve">Nessuna voce dello sprint 1 resta aperta lato sviluppo. Restano una conferma di KOS e alcune note per gli sprint successivi.</w:t>
+        <w:t xml:space="preserve">Nessuna voce dello sprint 1 resta aperta lato sviluppo. Restano un'approvazione e alcune note per gli sprint successivi.</w:t>
       </w:r>
     </w:p>
     <w:p>
@@ -2689,7 +2689,7 @@
         <w:t xml:space="preserve">Testo di llms.txt (kosgroup.com e anniazzurri.it)</w:t>
       </w:r>
       <w:r>
-        <w:t xml:space="preserve">: KOS conferma le due frasi di sintesi in apertura; il file è già pubblicato e si aggiorna in giornata.</w:t>
+        <w:t xml:space="preserve">: frasi di sintesi in apertura da approvare; il file è già pubblicato e si aggiorna in giornata.</w:t>
       </w:r>
     </w:p>
     <w:p>

</xml_diff>

<commit_message>
KOS-6 AA-19 nota di consegna: controllo esterno di AI visibility (100/100 sui due siti)
Co-Authored-By: Claude Opus 5.5 <noreply@anthropic.com>
Claude-Session: https://claude.ai/code/session_01Rr1X44gsg7BUwMzrRvYrc2
</commit_message>
<xml_diff>
--- a/docs/docx/nota-di-consegna-sprint-1.docx
+++ b/docs/docx/nota-di-consegna-sprint-1.docx
@@ -1550,6 +1550,24 @@
       </w:r>
       <w:r>
         <w:t xml:space="preserve">: gli elenchi pubblicati da OpenAI, Anthropic e Perplexity, scaricati il giorno stesso, confrontati con l'intero log degli errori di nginx (kosgroup.com da agosto 2024, anniazzurri.it da maggio 2022).</w:t>
+      </w:r>
+    </w:p>
+    <w:p>
+      <w:pPr>
+        <w:pStyle w:val="ListParagraph"/>
+        <w:numPr>
+          <w:ilvl w:val="0"/>
+          <w:numId w:val="2"/>
+        </w:numPr>
+      </w:pPr>
+      <w:r>
+        <w:rPr>
+          <w:b/>
+        </w:rPr>
+        <w:t xml:space="preserve">Controllo esterno</w:t>
+      </w:r>
+      <w:r>
+        <w:t xml:space="preserve">: uno strumento pubblico di AI visibility, che interroga il sito dai propri server con 33 user agent di motori, assistenti AI e crawler di addestramento, ha dato 100 su 100 a kosgroup.com (27 ottobre 2026) e ad anniazzurri.it (29 ottobre 2026): 33 crawler ammessi su 33 (11 di ricerca AI, 8 assistenti, 14 di addestramento), stessa pagina del browser, nessun noindex né X-Robots-Tag. Stesso risultato sui due siti; schermate allegate alla consegna.</w:t>
       </w:r>
     </w:p>
     <w:tbl>

</xml_diff>

<commit_message>
Nota di consegna sprint 1: evidenze conservate come controprova, non allegate
Co-Authored-By: Claude Opus 5.5 <noreply@anthropic.com>
Claude-Session: https://claude.ai/code/session_01Rr1X44gsg7BUwMzrRvYrc2
</commit_message>
<xml_diff>
--- a/docs/docx/nota-di-consegna-sprint-1.docx
+++ b/docs/docx/nota-di-consegna-sprint-1.docx
@@ -1567,7 +1567,7 @@
         <w:t xml:space="preserve">Controllo esterno</w:t>
       </w:r>
       <w:r>
-        <w:t xml:space="preserve">: uno strumento pubblico di AI visibility, che interroga il sito dai propri server con 33 user agent di motori, assistenti AI e crawler di addestramento, ha dato 100 su 100 a kosgroup.com (27 ottobre 2026) e ad anniazzurri.it (29 ottobre 2026): 33 crawler ammessi su 33 (11 di ricerca AI, 8 assistenti, 14 di addestramento), stessa pagina del browser, nessun noindex né X-Robots-Tag. Stesso risultato sui due siti; schermate allegate alla consegna.</w:t>
+        <w:t xml:space="preserve">: uno strumento pubblico di AI visibility, che interroga il sito dai propri server con 33 user agent di motori, assistenti AI e crawler di addestramento, ha dato 100 su 100 a kosgroup.com (27 ottobre 2026) e ad anniazzurri.it (29 ottobre 2026): 33 crawler ammessi su 33 (11 di ricerca AI, 8 assistenti, 14 di addestramento), stessa pagina del browser, nessun noindex né X-Robots-Tag. Stesso risultato sui due siti.</w:t>
       </w:r>
     </w:p>
     <w:tbl>
@@ -2396,7 +2396,7 @@
         <w:t xml:space="preserve">@graph</w:t>
       </w:r>
       <w:r>
-        <w:t xml:space="preserve">, un solo canonical, almeno un H1 e briciole JSON-LD uguali a quelle visibili; 12 user agent di bot AI e motori, 3 richieste ciascuno su 3 pagine per sito, tutte 200 tra 0,3 e 1,6 secondi. Rapporto allegato alla consegna.</w:t>
+        <w:t xml:space="preserve">, un solo canonical, almeno un H1 e briciole JSON-LD uguali a quelle visibili; 12 user agent di bot AI e motori, 3 richieste ciascuno su 3 pagine per sito, tutte 200 tra 0,3 e 1,6 secondi. Rapporto della verifica e schermate disponibili su richiesta.</w:t>
       </w:r>
     </w:p>
     <w:p>

</xml_diff>

<commit_message>
Nota di consegna sprint 1: llms.txt in produzione, sintesi dai contenuti istituzionali
Co-Authored-By: Claude Opus 5.5 <noreply@anthropic.com>
Claude-Session: https://claude.ai/code/session_01Rr1X44gsg7BUwMzrRvYrc2
</commit_message>
<xml_diff>
--- a/docs/docx/nota-di-consegna-sprint-1.docx
+++ b/docs/docx/nota-di-consegna-sprint-1.docx
@@ -33,7 +33,7 @@
     <w:p>
       <w:pPr/>
       <w:r>
-        <w:t xml:space="preserve">Le dieci voci d'audit dello sprint 1 sono chiuse: sei con interventi in produzione, quattro risultavano già a posto e sono verificate con evidenza. Resta da approvare il testo di sintesi di llms.txt, già pubblicato.</w:t>
+        <w:t xml:space="preserve">Le dieci voci d'audit dello sprint 1 sono chiuse: sei con interventi in produzione, quattro risultavano già a posto e sono verificate con evidenza. Il testo di sintesi di llms.txt riprende i contenuti istituzionali dei siti; eventuali revisioni si applicano in giornata.</w:t>
       </w:r>
     </w:p>
     <w:tbl>
@@ -327,7 +327,7 @@
           <w:p>
             <w:pPr/>
             <w:r>
-              <w:t xml:space="preserve">Da approvare</w:t>
+              <w:t xml:space="preserve">In produzione</w:t>
             </w:r>
           </w:p>
         </w:tc>
@@ -988,7 +988,7 @@
               <w:t xml:space="preserve">text/plain; charset=utf-8</w:t>
             </w:r>
             <w:r>
-              <w:t xml:space="preserve">. Testo della sintesi da approvare.</w:t>
+              <w:t xml:space="preserve">. La sintesi riprende i contenuti istituzionali del sito.</w:t>
             </w:r>
           </w:p>
         </w:tc>
@@ -2710,7 +2710,7 @@
     <w:p>
       <w:pPr/>
       <w:r>
-        <w:t xml:space="preserve">Nessuna voce dello sprint 1 resta aperta lato sviluppo. Restano un'approvazione e alcune note per gli sprint successivi.</w:t>
+        <w:t xml:space="preserve">Nessuna voce dello sprint 1 resta aperta lato sviluppo. Restano alcune note per gli sprint successivi.</w:t>
       </w:r>
     </w:p>
     <w:p>
@@ -2728,7 +2728,7 @@
         <w:t xml:space="preserve">Testo di llms.txt (kosgroup.com e anniazzurri.it)</w:t>
       </w:r>
       <w:r>
-        <w:t xml:space="preserve">: frasi di sintesi in apertura da approvare; il file è già pubblicato e si aggiorna in giornata.</w:t>
+        <w:t xml:space="preserve">: frasi di sintesi ricavate dai contenuti istituzionali dei due siti; eventuali revisioni richieste da KOS o dall'agenzia si applicano in giornata.</w:t>
       </w:r>
     </w:p>
     <w:p>

</xml_diff>

<commit_message>
Nota di consegna sprint 1: verifica completa del 30/10 (861 + 449 pagine, un solo JSON-LD, canonical e H1), data di consegna
Co-Authored-By: Claude Opus 5.5 <noreply@anthropic.com>
Claude-Session: https://claude.ai/code/session_01Rr1X44gsg7BUwMzrRvYrc2
</commit_message>
<xml_diff>
--- a/docs/docx/nota-di-consegna-sprint-1.docx
+++ b/docs/docx/nota-di-consegna-sprint-1.docx
@@ -5781,7 +5781,7 @@
           <w:sz w:val="21"/>
           <w:szCs w:val="21"/>
         </w:rPr>
-        <w:t xml:space="preserve">Verifica completa del 29 ottobre in produzione, con uno script ripetibile su tutte le pagine delle sitemap (861 kosgroup.com, 449 anniazzurri.it): tutte le voci dello sprint 1 superate. Sulle 449 pagine di anniazzurri.it un solo </w:t>
+        <w:t xml:space="preserve">Verifica completa del 30 ottobre in produzione, con uno script ripetibile su tutte le pagine delle sitemap (861 kosgroup.com, 449 anniazzurri.it): tutte le voci dello sprint 1 superate. Su tutte le pagine dei due siti l'HTML servito ha un solo blocco JSON-LD, un solo canonical e un solo H1; sulle 449 pagine di anniazzurri.it un solo </w:t>
       </w:r>
       <w:r>
         <w:rPr>
@@ -5799,7 +5799,7 @@
           <w:sz w:val="21"/>
           <w:szCs w:val="21"/>
         </w:rPr>
-        <w:t xml:space="preserve">, un solo canonical, almeno un H1 e briciole JSON-LD uguali a quelle visibili; 12 user agent di bot AI e motori, 3 richieste ciascuno su 3 pagine per sito, tutte 200 tra 0,3 e 1,6 secondi. Rapporto della verifica e schermate disponibili su richiesta.</w:t>
+        <w:t xml:space="preserve">, collegato all'ente, e briciole JSON-LD uguali a quelle visibili. 12 user agent di bot AI e motori, 3 richieste ciascuno su 3 pagine per sito: tutte 200, tra 0,3 e 1,7 secondi. Rapporto della verifica e schermate disponibili su richiesta.</w:t>
       </w:r>
     </w:p>
     <w:p>
@@ -5847,7 +5847,7 @@
         </w:rPr>
         <w:t xml:space="preserve">: </w:t>
       </w:r>
-      <w:hyperlink w:history="1" r:id="rIdptc0z8qazobnw53zy1mku">
+      <w:hyperlink w:history="1" r:id="rIdr738jnvfm1flkacljnjoy">
         <w:r>
           <w:rPr>
             <w:rFonts w:ascii="Arial" w:cs="Arial" w:eastAsia="Arial" w:hAnsi="Arial"/>
@@ -5868,7 +5868,7 @@
         </w:rPr>
         <w:t xml:space="preserve"> e </w:t>
       </w:r>
-      <w:hyperlink w:history="1" r:id="rIdek4ohohaekfyuotvnxwpz">
+      <w:hyperlink w:history="1" r:id="rIdr45p3ozmfsydg4qikaow1">
         <w:r>
           <w:rPr>
             <w:rFonts w:ascii="Arial" w:cs="Arial" w:eastAsia="Arial" w:hAnsi="Arial"/>

</xml_diff>